<commit_message>
docx: emit institution block in upper-case to match template fidelity
</commit_message>
<xml_diff>
--- a/web/public/SentinelCloud_Capstone_Report.docx
+++ b/web/public/SentinelCloud_Capstone_Report.docx
@@ -195,7 +195,7 @@
           <w:sz w:val="22"/>
           <w:szCs w:val="22"/>
         </w:rPr>
-        <w:t xml:space="preserve">Yogananda School of AI, Computers and Data Sciences</w:t>
+        <w:t xml:space="preserve">YOGANANDA SCHOOL OF AI, COMPUTERS AND DATA SCIENCES</w:t>
       </w:r>
     </w:p>
     <w:p>
@@ -211,7 +211,7 @@
           <w:sz w:val="22"/>
           <w:szCs w:val="22"/>
         </w:rPr>
-        <w:t xml:space="preserve">Shoolini University of Biotechnology and Management Sciences</w:t>
+        <w:t xml:space="preserve">SHOOLINI UNIVERSITY OF BIOTECHNOLOGY AND MANAGEMENT SCIENCES</w:t>
       </w:r>
     </w:p>
     <w:p>
@@ -227,7 +227,7 @@
           <w:sz w:val="22"/>
           <w:szCs w:val="22"/>
         </w:rPr>
-        <w:t xml:space="preserve">Solan, H.P., India</w:t>
+        <w:t xml:space="preserve">SOLAN, H.P., INDIA</w:t>
       </w:r>
     </w:p>
     <w:p>

</xml_diff>

<commit_message>
privacy: replace personal project + email leaks with placeholders
The public /docs page was rendering 'divyamohan1993@gmail.com' as the
ADMIN_EMAILS default and 'dmjone' as GOOGLE_CLOUD_PROJECT default.
Same leaks were sprinkled across README, DEPLOY, RUNBOOK, SECURITY,
CAPSTONE_REPORT, CHANGELOG and several React pages as part of
copy-pasteable command examples.

Sweep replaces with '<your-gcp-project>', '<owner-email>' and
'<project-number>' so anyone reading the public site or forking the
repo gets a clear placeholder rather than the original deployment's
metadata. The actual deployment continues to set these via Cloud Run
--set-env-vars at deploy time, so behaviour is unchanged.

env.ts defaults are now empty rather than falling back to the
deployment's project id.
</commit_message>
<xml_diff>
--- a/web/public/SentinelCloud_Capstone_Report.docx
+++ b/web/public/SentinelCloud_Capstone_Report.docx
@@ -3858,7 +3858,7 @@
           <w:sz w:val="20"/>
           <w:szCs w:val="20"/>
         </w:rPr>
-        <w:t xml:space="preserve">  --source . --region asia-east1 --project dmjone \</w:t>
+        <w:t xml:space="preserve">  --source . --region asia-east1 --project &lt;your-gcp-project&gt; \</w:t>
       </w:r>
       <w:r>
         <w:br/>
@@ -3902,7 +3902,7 @@
           <w:sz w:val="20"/>
           <w:szCs w:val="20"/>
         </w:rPr>
-        <w:t xml:space="preserve">  --service-account=107722137045-compute@developer.gserviceaccount.com \</w:t>
+        <w:t xml:space="preserve">  --service-account=&lt;project-number&gt;-compute@developer.gserviceaccount.com \</w:t>
       </w:r>
       <w:r>
         <w:br/>
@@ -3913,7 +3913,7 @@
           <w:sz w:val="20"/>
           <w:szCs w:val="20"/>
         </w:rPr>
-        <w:t xml:space="preserve">  --set-env-vars="GOOGLE_CLOUD_PROJECT=dmjone,SENTINEL_REGION=asia-east1,\</w:t>
+        <w:t xml:space="preserve">  --set-env-vars="GOOGLE_CLOUD_PROJECT=&lt;your-gcp-project&gt;,SENTINEL_REGION=asia-east1,\</w:t>
       </w:r>
       <w:r>
         <w:br/>
@@ -4313,7 +4313,7 @@
           <w:sz w:val="22"/>
           <w:szCs w:val="22"/>
         </w:rPr>
-        <w:t xml:space="preserve">Cloud Run scales horizontally with no code change. Each request runs in its own container so concurrent runs do not block one another. Vertex AI Gemini quotas are the practical ceiling; default capacity in dmjone is well above ten thousand requests per minute on Flash. The deterministic stub absorbs any quota exhaustion automatically. Firestore writes are per-episode, not per-step, and stay under a thousand writes per minute even at 10x scale. The SSE channel is one connection per active run; we never multiplex, so back-pressure is bounded. For peak protection, a token-bucket rate limiter at the API route caps runs per IP per minute, and the policy constitution itself caps actions per target per minute as a defence-in-depth layer. Static pages are cached at the edge, so the read-heavy path never touches the origin.</w:t>
+        <w:t xml:space="preserve">Cloud Run scales horizontally with no code change. Each request runs in its own container so concurrent runs do not block one another. Vertex AI Gemini quotas are the practical ceiling; default capacity in our GCP project is well above ten thousand requests per minute on Flash. The deterministic stub absorbs any quota exhaustion automatically. Firestore writes are per-episode, not per-step, and stay under a thousand writes per minute even at 10x scale. The SSE channel is one connection per active run; we never multiplex, so back-pressure is bounded. For peak protection, a token-bucket rate limiter at the API route caps runs per IP per minute, and the policy constitution itself caps actions per target per minute as a defence-in-depth layer. Static pages are cached at the edge, so the read-heavy path never touches the origin.</w:t>
       </w:r>
     </w:p>
     <w:p>

</xml_diff>